<commit_message>
docs: finalize RentCottage MVP sign-off package
</commit_message>
<xml_diff>
--- a/docs/product/RentCottage-MVP-PRD.docx
+++ b/docs/product/RentCottage-MVP-PRD.docx
@@ -333,7 +333,7 @@
                 <w:color w:val="273137"/>
                 <w:sz w:val="19"/>
               </w:rPr>
-              <w:t xml:space="preserve"> This agreement defines the product and business rules for the RentCottage MVP. Supplier selection, legal advice, final visual design and the separate delivery proposal remain launch or commercial decisions.</w:t>
+              <w:t xml:space="preserve"> This agreement defines the product and business rules for the RentCottage MVP. Payment-provider selection, legal document requirements, service-fee validation and supplier checks remain launch decisions listed in this agreement.</w:t>
             </w:r>
           </w:p>
         </w:tc>
@@ -525,7 +525,7 @@
           <w:color w:val="273137"/>
           <w:sz w:val="21"/>
         </w:rPr>
-        <w:t>Cottage owners can apply directly. RentCottage checks and approves each owner and cottage before it becomes public.</w:t>
+        <w:t>Cottage owners can apply directly by creating a private first cottage page and uploading their evidence. RentCottage checks and approves each owner and cottage before it becomes public.</w:t>
       </w:r>
     </w:p>
     <w:p>
@@ -793,7 +793,7 @@
                 <w:color w:val="273137"/>
                 <w:sz w:val="18"/>
               </w:rPr>
-              <w:t>Browse without an account; verify a phone number when requesting</w:t>
+              <w:t>Browse without an account; verify a phone number before first messaging or requesting</w:t>
             </w:r>
           </w:p>
         </w:tc>
@@ -851,7 +851,7 @@
                 <w:color w:val="273137"/>
                 <w:sz w:val="18"/>
               </w:rPr>
-              <w:t>Apply directly, upload evidence and wait for approval</w:t>
+              <w:t>Apply directly with a private first cottage page and evidence, then wait for approval</w:t>
             </w:r>
           </w:p>
         </w:tc>
@@ -1339,77 +1339,135 @@
       </w:r>
     </w:p>
     <w:p>
-      <w:pPr>
-        <w:pStyle w:val="Heading2"/>
-      </w:pPr>
-      <w:r>
-        <w:t>Customer journey</w:t>
-      </w:r>
-    </w:p>
-    <w:p>
       <w:r>
         <w:rPr>
           <w:rFonts w:ascii="Arial" w:hAnsi="Arial"/>
           <w:color w:val="273137"/>
           <w:sz w:val="21"/>
         </w:rPr>
-        <w:t>Browse cottages → choose date and shift(s) → see the full price → verify phone → accept rules → authorise payment → send request → receive the owner's decision → payment is collected automatically if accepted → receive confirmation and contact details → attend → review the completed booking.</w:t>
-      </w:r>
-    </w:p>
-    <w:p>
-      <w:r>
-        <w:rPr>
-          <w:rFonts w:ascii="Arial" w:hAnsi="Arial"/>
-          <w:color w:val="273137"/>
-          <w:sz w:val="21"/>
-        </w:rPr>
-        <w:t>If automatic payment collection fails after owner acceptance, the customer has 20 minutes to provide a valid payment method. The booking is confirmed only when payment succeeds.</w:t>
-      </w:r>
-    </w:p>
-    <w:p>
-      <w:pPr>
-        <w:pStyle w:val="Heading2"/>
-      </w:pPr>
-      <w:r>
-        <w:t>Cottage owner journey</w:t>
-      </w:r>
-    </w:p>
-    <w:p>
-      <w:r>
-        <w:rPr>
-          <w:rFonts w:ascii="Arial" w:hAnsi="Arial"/>
-          <w:color w:val="273137"/>
-          <w:sz w:val="21"/>
-        </w:rPr>
-        <w:t>Create an account → apply and upload evidence → answer any questions → receive approval → create cottage page → add shifts, prices and availability → submit content for approval → receive requests → accept or decline → prepare for paid bookings → receive the net payout after the booking period.</w:t>
-      </w:r>
-    </w:p>
-    <w:p>
-      <w:r>
-        <w:rPr>
-          <w:rFonts w:ascii="Arial" w:hAnsi="Arial"/>
-          <w:color w:val="273137"/>
-          <w:sz w:val="21"/>
-        </w:rPr>
-        <w:t>A complete owner application has a three-day review target. The target pauses while RentCottage waits for missing information.</w:t>
-      </w:r>
-    </w:p>
-    <w:p>
-      <w:pPr>
-        <w:pStyle w:val="Heading2"/>
-      </w:pPr>
-      <w:r>
-        <w:t>RentCottage team journey</w:t>
-      </w:r>
-    </w:p>
-    <w:p>
-      <w:r>
-        <w:rPr>
-          <w:rFonts w:ascii="Arial" w:hAnsi="Arial"/>
-          <w:color w:val="273137"/>
-          <w:sz w:val="21"/>
-        </w:rPr>
-        <w:t>Review owners and documents → approve cottages and content → monitor requests, payments and refunds → moderate messages and reviews → handle incidents and exceptions → view basic marketplace and finance totals.</w:t>
+        <w:t>These visual summaries show the owner, customer and RentCottage journeys in plain language. The capability and rule sections that follow remain the precise agreement.</w:t>
+      </w:r>
+    </w:p>
+    <w:p>
+      <w:pPr>
+        <w:spacing w:before="40" w:after="0"/>
+        <w:jc w:val="center"/>
+      </w:pPr>
+      <w:r>
+        <w:drawing>
+          <wp:inline xmlns:a="http://schemas.openxmlformats.org/drawingml/2006/main" xmlns:pic="http://schemas.openxmlformats.org/drawingml/2006/picture">
+            <wp:extent cx="4778058" cy="7635240"/>
+            <wp:docPr id="1" name="Picture 1" descr="Owner journey from direct application and a private first cottage page through separate owner and cottage approvals to publication." title="Owner journey from direct application and a private first cottage page through separate owner and cottage approvals to publication."/>
+            <wp:cNvGraphicFramePr>
+              <a:graphicFrameLocks noChangeAspect="1"/>
+            </wp:cNvGraphicFramePr>
+            <a:graphic>
+              <a:graphicData uri="http://schemas.openxmlformats.org/drawingml/2006/picture">
+                <pic:pic>
+                  <pic:nvPicPr>
+                    <pic:cNvPr id="0" name="RentCottage-Journey-1-How-a-cottage-becomes-available.png"/>
+                    <pic:cNvPicPr/>
+                  </pic:nvPicPr>
+                  <pic:blipFill>
+                    <a:blip r:embed="rId10"/>
+                    <a:stretch>
+                      <a:fillRect/>
+                    </a:stretch>
+                  </pic:blipFill>
+                  <pic:spPr>
+                    <a:xfrm>
+                      <a:off x="0" y="0"/>
+                      <a:ext cx="4778058" cy="7635240"/>
+                    </a:xfrm>
+                    <a:prstGeom prst="rect"/>
+                  </pic:spPr>
+                </pic:pic>
+              </a:graphicData>
+            </a:graphic>
+          </wp:inline>
+        </w:drawing>
+      </w:r>
+    </w:p>
+    <w:p>
+      <w:pPr>
+        <w:pageBreakBefore/>
+        <w:spacing w:before="40" w:after="0"/>
+        <w:jc w:val="center"/>
+      </w:pPr>
+      <w:r>
+        <w:drawing>
+          <wp:inline xmlns:a="http://schemas.openxmlformats.org/drawingml/2006/main" xmlns:pic="http://schemas.openxmlformats.org/drawingml/2006/picture">
+            <wp:extent cx="4558664" cy="8366760"/>
+            <wp:docPr id="2" name="Picture 2" descr="Customer journey from anonymous discovery and optional messaging through payment authorisation, request, owner decision, collection, confirmation and review." title="Customer journey from anonymous discovery and optional messaging through payment authorisation, request, owner decision, collection, confirmation and review."/>
+            <wp:cNvGraphicFramePr>
+              <a:graphicFrameLocks noChangeAspect="1"/>
+            </wp:cNvGraphicFramePr>
+            <a:graphic>
+              <a:graphicData uri="http://schemas.openxmlformats.org/drawingml/2006/picture">
+                <pic:pic>
+                  <pic:nvPicPr>
+                    <pic:cNvPr id="0" name="RentCottage-Journey-2-How-a-customer-books-and-pays.png"/>
+                    <pic:cNvPicPr/>
+                  </pic:nvPicPr>
+                  <pic:blipFill>
+                    <a:blip r:embed="rId11"/>
+                    <a:stretch>
+                      <a:fillRect/>
+                    </a:stretch>
+                  </pic:blipFill>
+                  <pic:spPr>
+                    <a:xfrm>
+                      <a:off x="0" y="0"/>
+                      <a:ext cx="4558664" cy="8366760"/>
+                    </a:xfrm>
+                    <a:prstGeom prst="rect"/>
+                  </pic:spPr>
+                </pic:pic>
+              </a:graphicData>
+            </a:graphic>
+          </wp:inline>
+        </w:drawing>
+      </w:r>
+    </w:p>
+    <w:p>
+      <w:pPr>
+        <w:pageBreakBefore/>
+        <w:spacing w:before="40" w:after="0"/>
+        <w:jc w:val="center"/>
+      </w:pPr>
+      <w:r>
+        <w:drawing>
+          <wp:inline xmlns:a="http://schemas.openxmlformats.org/drawingml/2006/main" xmlns:pic="http://schemas.openxmlformats.org/drawingml/2006/picture">
+            <wp:extent cx="5562856" cy="8366760"/>
+            <wp:docPr id="3" name="Picture 3" descr="RentCottage operating view covering approvals, payment oversight, refunds, moderation, incidents, reporting and unresolved launch decisions." title="RentCottage operating view covering approvals, payment oversight, refunds, moderation, incidents, reporting and unresolved launch decisions."/>
+            <wp:cNvGraphicFramePr>
+              <a:graphicFrameLocks noChangeAspect="1"/>
+            </wp:cNvGraphicFramePr>
+            <a:graphic>
+              <a:graphicData uri="http://schemas.openxmlformats.org/drawingml/2006/picture">
+                <pic:pic>
+                  <pic:nvPicPr>
+                    <pic:cNvPr id="0" name="RentCottage-Journey-3-How-RentCottage-runs-the-marketplace.png"/>
+                    <pic:cNvPicPr/>
+                  </pic:nvPicPr>
+                  <pic:blipFill>
+                    <a:blip r:embed="rId12"/>
+                    <a:stretch>
+                      <a:fillRect/>
+                    </a:stretch>
+                  </pic:blipFill>
+                  <pic:spPr>
+                    <a:xfrm>
+                      <a:off x="0" y="0"/>
+                      <a:ext cx="5562856" cy="8366760"/>
+                    </a:xfrm>
+                    <a:prstGeom prst="rect"/>
+                  </pic:spPr>
+                </pic:pic>
+              </a:graphicData>
+            </a:graphic>
+          </wp:inline>
+        </w:drawing>
       </w:r>
     </w:p>
     <w:p>
@@ -1813,7 +1871,7 @@
                 <w:color w:val="273137"/>
                 <w:sz w:val="18"/>
               </w:rPr>
-              <w:t>An owner can create an account, enter details, upload identity, authority-to-rent and applicable licence evidence, and submit the application. RentCottage can request missing information, approve or reject it, and record who decided and why. Documents are private and limited to authorised staff. An owner cannot publish or receive requests before approval.</w:t>
+              <w:t>An owner can create an account, prepare a private first cottage page, upload identity, authority-to-rent and applicable licence evidence, and submit everything together. RentCottage can request missing information, approve or reject the owner, and record who decided and why. Documents and the draft page remain private and limited to authorised staff. The cottage cannot become public or receive requests until both owner and cottage approvals are complete.</w:t>
             </w:r>
           </w:p>
         </w:tc>
@@ -2009,7 +2067,7 @@
                 <w:color w:val="273137"/>
                 <w:sz w:val="18"/>
               </w:rPr>
-              <w:t>The cottage requires photos, capacity, rooms, amenities, approximate location and house rules. The owner may enter text in Arabic, Sorani or English. The system creates draft translations, preserves the original and lets RentCottage approve all language versions before publication. Later content changes are reviewed while the last approved version remains public.</w:t>
+              <w:t>The first private cottage page starts during the owner application; approved owners may create more. Each cottage requires photos, capacity, rooms, amenities, approximate location and house rules. The owner may enter text in Arabic, Sorani or English. The system creates draft translations, preserves the original and lets RentCottage approve all language versions before publication. Later content changes are reviewed while the last approved version remains public.</w:t>
             </w:r>
           </w:p>
         </w:tc>
@@ -2400,7 +2458,7 @@
                 <w:color w:val="273137"/>
                 <w:sz w:val="18"/>
               </w:rPr>
-              <w:t>The customer can select one or more shifts across consecutive days or choose a full-day option. The price shows the cottage booking price, fixed RentCottage service fee and customer total. The customer enters party size, accepts the rules and authorises the full total before sending the request. The request holds every selected shift and gives the owner four hours to accept or decline. Payment is collected automatically after acceptance. Declined, withdrawn or expired requests release the authorisation. No cash or unpaid fallback is included.</w:t>
+              <w:t>The customer can select one or more shifts across consecutive days, including a separately priced full-day option on each day. Consecutive full-day selections provide continuous access between days. The price shows the cottage booking price, fixed RentCottage service fee and customer total. The customer enters party size, accepts the rules and authorises the full total before sending the request. The request holds every selected shift and gives the owner four hours to accept or decline. Payment is collected automatically after acceptance. Declined, withdrawn or expired requests release the authorisation. No cash or unpaid fallback is included.</w:t>
             </w:r>
           </w:p>
         </w:tc>
@@ -2791,7 +2849,7 @@
                 <w:color w:val="273137"/>
                 <w:sz w:val="18"/>
               </w:rPr>
-              <w:t>Text conversations are linked to the cottage or booking. Before payment, the system blocks phone numbers, email addresses, web links and social handles. After payment, contact details may be shared. Messages can be translated, while the original remains viewable. A booking conversation becomes read-only seven days after the booking ends. Audio and video calls are not included.</w:t>
+              <w:t>After phone verification, a customer can start a text conversation from a cottage page before requesting and continue it through the request and booking. Before payment, the system blocks phone numbers, email addresses, web links and social handles, including common disguised number formats; repeated bypass attempts can be reviewed by RentCottage. After payment, contact details may be shared. Messages can be translated, while the original remains viewable. A booking conversation becomes read-only seven days after the booking ends. Audio and video calls are not included.</w:t>
             </w:r>
           </w:p>
         </w:tc>
@@ -2986,7 +3044,7 @@
                 <w:color w:val="273137"/>
                 <w:sz w:val="18"/>
               </w:rPr>
-              <w:t>Cancelling at least 48 hours before the first booked shift automatically returns the full customer total, including the service fee. Cancelling inside 48 hours, or not attending, receives no refund. If the owner or RentCottage cancels, the customer automatically receives the full total. An administrator can approve a manual refund exception. The policy is shown before payment and uses Iraq time.</w:t>
+              <w:t>Cancelling at least 48 hours before the first booked shift automatically returns the full customer total, including the service fee. Cancelling inside 48 hours, or not attending, receives no refund under the standard policy. If the owner or RentCottage cancels, the customer automatically receives the full total. An administrator can approve a recorded full or partial refund exception. The policy is shown before payment and uses Iraq time.</w:t>
             </w:r>
           </w:p>
         </w:tc>
@@ -3182,7 +3240,7 @@
                 <w:color w:val="273137"/>
                 <w:sz w:val="18"/>
               </w:rPr>
-              <w:t>A customer can leave one rating from one to five stars and a written review within 14 days of a completed paid booking. The owner may post one public reply. Reviews and replies can be translated with the original available. RentCottage can hide content that breaches the rules while retaining the internal record.</w:t>
+              <w:t>A customer can leave one rating from one to five stars, with an optional written review, within 14 days of a completed paid booking. The owner may post one public reply. Neither reviews nor replies may contain contact details or external links. Reviews and replies can be translated with the original available. RentCottage can hide content that breaches the rules while retaining the internal record.</w:t>
             </w:r>
           </w:p>
         </w:tc>
@@ -3377,7 +3435,7 @@
                 <w:color w:val="273137"/>
                 <w:sz w:val="18"/>
               </w:rPr>
-              <w:t>Owners see the booking price, 10% commission, refund outcome and expected or paid payout per booking, plus simple totals. Administrators see applications, approval queues, bookings, payment and refund states, incidents, reviews, and simple totals for bookings, gross value, commission, service fees and owner payouts. Data can be exported for operational follow-up.</w:t>
+              <w:t>Owners see the booking price, 10% commission, refund outcome and expected or paid payout per booking, plus simple totals. Administrators can search customer and owner accounts and cottage pages; edit or hide cottage content; suspend or reactivate accounts and cottages; and see applications, approval queues, bookings, payment and refund states, incidents, reviews, and simple totals for bookings, gross value, commission, service fees and owner payouts. Data can be exported for operational follow-up.</w:t>
             </w:r>
           </w:p>
         </w:tc>
@@ -4255,6 +4313,26 @@
           <w:color w:val="273137"/>
           <w:sz w:val="19"/>
         </w:rPr>
+        <w:t>Automatically translated content is labelled, the original remains available and is shown if translation fails, and users can report a poor or inappropriate translation.</w:t>
+      </w:r>
+    </w:p>
+    <w:p>
+      <w:pPr>
+        <w:ind w:left="312" w:hanging="142"/>
+      </w:pPr>
+      <w:r>
+        <w:rPr>
+          <w:rFonts w:ascii="Arial" w:hAnsi="Arial"/>
+          <w:color w:val="2F7868"/>
+        </w:rPr>
+        <w:t xml:space="preserve">•  </w:t>
+      </w:r>
+      <w:r>
+        <w:rPr>
+          <w:rFonts w:ascii="Arial" w:hAnsi="Arial"/>
+          <w:color w:val="273137"/>
+          <w:sz w:val="19"/>
+        </w:rPr>
         <w:t>RentCottage records important administrator actions and access to verification documents.</w:t>
       </w:r>
     </w:p>
@@ -4984,7 +5062,7 @@
                 <w:color w:val="273137"/>
                 <w:sz w:val="18"/>
               </w:rPr>
-              <w:t>Partial late-cancellation refunds</w:t>
+              <w:t>Partial refunds under the standard cancellation policy</w:t>
             </w:r>
           </w:p>
         </w:tc>
@@ -5008,7 +5086,7 @@
                 <w:color w:val="273137"/>
                 <w:sz w:val="18"/>
               </w:rPr>
-              <w:t>The standard policy is full refund at least 48 hours before the first shift, otherwise no refund. Administrators may make a manual exception.</w:t>
+              <w:t>The standard policy is a full refund at least 48 hours before the first shift, otherwise no refund. An administrator may still approve and record a full or partial exception.</w:t>
             </w:r>
           </w:p>
         </w:tc>

</xml_diff>